<commit_message>
Narration plays as audio only with the 3D print (Luke 22 Oct 2026)
Form description (EN/JA), narration notes and review copies updated.

Co-Authored-By: Claude Opus 5.5 (1M context) <noreply@anthropic.com>
Claude-Session: https://claude.ai/code/session_01FmEXckkZCHeetJEUVKh7mV
</commit_message>
<xml_diff>
--- a/study/ms-forms/form-review_JA.docx
+++ b/study/ms-forms/form-review_JA.docx
@@ -412,7 +412,7 @@
               <w:rPr>
                 <w:b w:val="0"/>
               </w:rPr>
-              <w:t>What happens: Look at the four patient education materials, one after the other, for a short, fixed time each, in a randomised order: a 2D information sheet (printed on paper), an augmented reality (AR) model on a web page (shown on the study iPad), a 3D printed model and a narrated video of the 3D model. Each one shows all three stages. After all four patient education materials have been seen, answer the questions on this form.</w:t>
+              <w:t>What happens: Look at the four patient education materials, one after the other, for a short, fixed time each, in a randomised order: a 2D information sheet (printed on paper), an augmented reality (AR) model on a web page (shown on the study iPad), a 3D printed model with a short spoken explanation (audio only) and a narrated video of the 3D model. Each one shows all three stages. After all four patient education materials have been seen, answer the questions on this form.</w:t>
             </w:r>
           </w:p>
         </w:tc>
@@ -426,7 +426,7 @@
               <w:rPr>
                 <w:b w:val="0"/>
               </w:rPr>
-              <w:t>参加の内容：4つのかん者向け説明資料を、ランダムな順番で1つずつ、決められた短い時間で見ます：2D説明シート（紙に印刷）、ウェブページ上の拡張現実（AR）モデル（研究用のiPadで見ます）、3Dプリントモデル、3Dモデルのナレーション付き動画。どの資料も3つの段階すべてを説明しています。4つすべてを見たあとで、このフォームの質問に答えます。</w:t>
+              <w:t>参加の内容：4つのかん者向け説明資料を、ランダムな順番で1つずつ、決められた短い時間で見ます：2D説明シート（紙に印刷）、ウェブページ上の拡張現実（AR）モデル（研究用のiPadで見ます）、短い音声の説明が付いた3Dプリントモデル、3Dモデルのナレーション付き動画。どの資料も3つの段階すべてを説明しています。4つすべてを見たあとで、このフォームの質問に答えます。</w:t>
             </w:r>
           </w:p>
         </w:tc>
@@ -455,7 +455,7 @@
                 <w:b w:val="0"/>
                 <w:color w:val="56636F"/>
               </w:rPr>
-              <w:t>Viewing time per material is set in the pilot, so no seconds are given. Materials listed in study order A-D.</w:t>
+              <w:t>Viewing time per material is set in the pilot, so no seconds are given. Materials listed in study order A-D. The print plays the narration as audio only from the study device (Luke, 22 Oct 2026).</w:t>
             </w:r>
           </w:p>
         </w:tc>

</xml_diff>